<commit_message>
Update CURRICULUM VITAE GLORY.docx
</commit_message>
<xml_diff>
--- a/CURRICULUM VITAE GLORY.docx
+++ b/CURRICULUM VITAE GLORY.docx
@@ -421,6 +421,25 @@
                 <w:szCs w:val="24"/>
               </w:rPr>
             </w:pPr>
+            <w:hyperlink r:id="rId11" w:history="1">
+              <w:r>
+                <w:rPr>
+                  <w:rStyle w:val="Hyperlink"/>
+                  <w:rFonts w:ascii="Calibri" w:hAnsi="Calibri" w:cs="Calibri"/>
+                  <w:sz w:val="24"/>
+                  <w:szCs w:val="24"/>
+                </w:rPr>
+                <w:t>https://glory-nyawira.vercel.app</w:t>
+              </w:r>
+            </w:hyperlink>
+            <w:r>
+              <w:rPr>
+                <w:rFonts w:ascii="Calibri" w:hAnsi="Calibri" w:cs="Calibri"/>
+                <w:sz w:val="24"/>
+                <w:szCs w:val="24"/>
+              </w:rPr>
+              <w:t xml:space="preserve"> </w:t>
+            </w:r>
           </w:p>
           <w:p>
             <w:pPr>
@@ -655,31 +674,126 @@
           </w:p>
           <w:p>
             <w:pPr>
-              <w:rPr>
-                <w:rFonts w:ascii="Calibri" w:hAnsi="Calibri" w:cs="Calibri"/>
-                <w:sz w:val="24"/>
-                <w:szCs w:val="24"/>
-              </w:rPr>
-            </w:pPr>
-            <w:r>
-              <w:rPr>
-                <w:rFonts w:ascii="Calibri" w:hAnsi="Calibri" w:cs="Calibri"/>
-                <w:sz w:val="24"/>
-                <w:szCs w:val="24"/>
-              </w:rPr>
-              <w:t xml:space="preserve">        </w:t>
-            </w:r>
-          </w:p>
-          <w:p>
-            <w:pPr>
-              <w:rPr>
-                <w:rFonts w:ascii="Calibri" w:hAnsi="Calibri" w:cs="Calibri"/>
-                <w:sz w:val="24"/>
-                <w:szCs w:val="24"/>
-              </w:rPr>
-            </w:pPr>
-            <w:bookmarkStart w:id="0" w:name="_GoBack"/>
-            <w:bookmarkEnd w:id="0"/>
+              <w:pStyle w:val="ListParagraph"/>
+              <w:numPr>
+                <w:ilvl w:val="0"/>
+                <w:numId w:val="12"/>
+              </w:numPr>
+              <w:rPr>
+                <w:rFonts w:ascii="Calibri" w:hAnsi="Calibri" w:cs="Calibri"/>
+                <w:sz w:val="28"/>
+                <w:szCs w:val="24"/>
+              </w:rPr>
+            </w:pPr>
+            <w:r>
+              <w:rPr>
+                <w:rFonts w:ascii="Calibri" w:hAnsi="Calibri" w:cs="Calibri"/>
+                <w:b/>
+                <w:sz w:val="28"/>
+                <w:szCs w:val="24"/>
+              </w:rPr>
+              <w:t>Name</w:t>
+            </w:r>
+            <w:r>
+              <w:rPr>
+                <w:rFonts w:ascii="Calibri" w:hAnsi="Calibri" w:cs="Calibri"/>
+                <w:sz w:val="28"/>
+                <w:szCs w:val="24"/>
+              </w:rPr>
+              <w:t>: Madam I</w:t>
+            </w:r>
+            <w:r>
+              <w:rPr>
+                <w:rFonts w:ascii="Calibri" w:hAnsi="Calibri" w:cs="Calibri"/>
+                <w:sz w:val="28"/>
+                <w:szCs w:val="24"/>
+              </w:rPr>
+              <w:t xml:space="preserve">mmaculate </w:t>
+            </w:r>
+            <w:proofErr w:type="spellStart"/>
+            <w:r>
+              <w:rPr>
+                <w:rFonts w:ascii="Calibri" w:hAnsi="Calibri" w:cs="Calibri"/>
+                <w:sz w:val="28"/>
+                <w:szCs w:val="24"/>
+              </w:rPr>
+              <w:t>Nyabonyi</w:t>
+            </w:r>
+            <w:proofErr w:type="spellEnd"/>
+          </w:p>
+          <w:p>
+            <w:pPr>
+              <w:pStyle w:val="ListParagraph"/>
+              <w:ind w:left="360"/>
+              <w:rPr>
+                <w:rFonts w:ascii="Calibri" w:hAnsi="Calibri" w:cs="Calibri"/>
+                <w:sz w:val="28"/>
+                <w:szCs w:val="24"/>
+              </w:rPr>
+            </w:pPr>
+            <w:r>
+              <w:rPr>
+                <w:rFonts w:ascii="Calibri" w:hAnsi="Calibri" w:cs="Calibri"/>
+                <w:sz w:val="28"/>
+                <w:szCs w:val="24"/>
+              </w:rPr>
+              <w:t>Phone: +254 795 434 510</w:t>
+            </w:r>
+          </w:p>
+          <w:p>
+            <w:pPr>
+              <w:pStyle w:val="ListParagraph"/>
+              <w:ind w:left="360"/>
+              <w:rPr>
+                <w:rFonts w:ascii="Calibri" w:hAnsi="Calibri" w:cs="Calibri"/>
+                <w:sz w:val="28"/>
+                <w:szCs w:val="24"/>
+              </w:rPr>
+            </w:pPr>
+            <w:r>
+              <w:rPr>
+                <w:rFonts w:ascii="Calibri" w:hAnsi="Calibri" w:cs="Calibri"/>
+                <w:sz w:val="28"/>
+                <w:szCs w:val="24"/>
+              </w:rPr>
+              <w:t>Designation: Marketing manager</w:t>
+            </w:r>
+          </w:p>
+          <w:p>
+            <w:pPr>
+              <w:pStyle w:val="ListParagraph"/>
+              <w:ind w:left="360"/>
+              <w:rPr>
+                <w:rFonts w:ascii="Calibri" w:hAnsi="Calibri" w:cs="Calibri"/>
+                <w:sz w:val="28"/>
+                <w:szCs w:val="24"/>
+              </w:rPr>
+            </w:pPr>
+            <w:r>
+              <w:rPr>
+                <w:rFonts w:ascii="Calibri" w:hAnsi="Calibri" w:cs="Calibri"/>
+                <w:sz w:val="28"/>
+                <w:szCs w:val="24"/>
+              </w:rPr>
+              <w:t>Organization: Ardhi Sacco Society LTD</w:t>
+            </w:r>
+            <w:r>
+              <w:rPr>
+                <w:rFonts w:ascii="Calibri" w:hAnsi="Calibri" w:cs="Calibri"/>
+                <w:sz w:val="28"/>
+                <w:szCs w:val="24"/>
+              </w:rPr>
+              <w:t xml:space="preserve">     </w:t>
+            </w:r>
+          </w:p>
+          <w:p>
+            <w:pPr>
+              <w:rPr>
+                <w:rFonts w:ascii="Calibri" w:hAnsi="Calibri" w:cs="Calibri"/>
+                <w:sz w:val="24"/>
+                <w:szCs w:val="24"/>
+              </w:rPr>
+            </w:pPr>
           </w:p>
         </w:tc>
         <w:tc>
@@ -757,23 +871,7 @@
                 <w:sz w:val="24"/>
                 <w:szCs w:val="24"/>
               </w:rPr>
-              <w:t xml:space="preserve">Enthusiastic and customer-focused professional with hands-on experience </w:t>
-            </w:r>
-            <w:r>
-              <w:rPr>
-                <w:rFonts w:asciiTheme="minorHAnsi" w:hAnsiTheme="minorHAnsi" w:cstheme="minorHAnsi"/>
-                <w:sz w:val="24"/>
-                <w:szCs w:val="24"/>
-              </w:rPr>
-              <w:t>in</w:t>
-            </w:r>
-            <w:r>
-              <w:rPr>
-                <w:rFonts w:asciiTheme="minorHAnsi" w:hAnsiTheme="minorHAnsi" w:cstheme="minorHAnsi"/>
-                <w:sz w:val="24"/>
-                <w:szCs w:val="24"/>
-              </w:rPr>
-              <w:t xml:space="preserve"> retail service seeking a n internship in the business industry Skilled in communication, customer care and problem-solving </w:t>
+              <w:t xml:space="preserve">Enthusiastic and customer-focused professional with hands-on experience in retail service seeking a n internship in the business industry Skilled in communication, customer care and problem-solving </w:t>
             </w:r>
             <w:r>
               <w:rPr>
@@ -781,6 +879,7 @@
                 <w:noProof/>
                 <w:sz w:val="24"/>
                 <w:szCs w:val="24"/>
+                <w:lang w:eastAsia="en-US"/>
               </w:rPr>
               <w:drawing>
                 <wp:inline distT="0" distB="0" distL="0" distR="0" wp14:anchorId="2844E706" wp14:editId="765F9057">
@@ -796,7 +895,7 @@
                           <pic:cNvPicPr/>
                         </pic:nvPicPr>
                         <pic:blipFill>
-                          <a:blip r:embed="rId11"/>
+                          <a:blip r:embed="rId12"/>
                           <a:stretch>
                             <a:fillRect/>
                           </a:stretch>
@@ -822,23 +921,7 @@
                 <w:sz w:val="24"/>
                 <w:szCs w:val="24"/>
               </w:rPr>
-              <w:t xml:space="preserve">n fast-paced environments. </w:t>
-            </w:r>
-            <w:r>
-              <w:rPr>
-                <w:rFonts w:asciiTheme="minorHAnsi" w:hAnsiTheme="minorHAnsi" w:cstheme="minorHAnsi"/>
-                <w:sz w:val="24"/>
-                <w:szCs w:val="24"/>
-              </w:rPr>
-              <w:t>Passionate</w:t>
-            </w:r>
-            <w:r>
-              <w:rPr>
-                <w:rFonts w:asciiTheme="minorHAnsi" w:hAnsiTheme="minorHAnsi" w:cstheme="minorHAnsi"/>
-                <w:sz w:val="24"/>
-                <w:szCs w:val="24"/>
-              </w:rPr>
-              <w:t xml:space="preserve"> about delivering world-class s</w:t>
+              <w:t>n fast-paced environments. Passionate about delivering world-class s</w:t>
             </w:r>
             <w:r>
               <w:rPr>
@@ -872,23 +955,7 @@
                 <w:sz w:val="24"/>
                 <w:szCs w:val="24"/>
               </w:rPr>
-              <w:t xml:space="preserve"> and representing an organization of </w:t>
-            </w:r>
-            <w:r>
-              <w:rPr>
-                <w:rFonts w:asciiTheme="minorHAnsi" w:hAnsiTheme="minorHAnsi" w:cstheme="minorHAnsi"/>
-                <w:sz w:val="24"/>
-                <w:szCs w:val="24"/>
-              </w:rPr>
-              <w:t>repute with</w:t>
-            </w:r>
-            <w:r>
-              <w:rPr>
-                <w:rFonts w:asciiTheme="minorHAnsi" w:hAnsiTheme="minorHAnsi" w:cstheme="minorHAnsi"/>
-                <w:sz w:val="24"/>
-                <w:szCs w:val="24"/>
-              </w:rPr>
-              <w:t xml:space="preserve"> profess</w:t>
+              <w:t xml:space="preserve"> and representing an organization of repute with profess</w:t>
             </w:r>
             <w:r>
               <w:rPr>
@@ -957,7 +1024,7 @@
                 <w:rFonts w:asciiTheme="minorHAnsi" w:hAnsiTheme="minorHAnsi" w:cstheme="minorHAnsi"/>
                 <w:sz w:val="24"/>
               </w:rPr>
-              <w:t>Kenya College of Accountancy University, Nairobi | 2024 — Present</w:t>
+              <w:t>KCA University, Nairobi | 2023 — 2025</w:t>
             </w:r>
           </w:p>
           <w:p>
@@ -1037,15 +1104,7 @@
                 <w:b/>
                 <w:sz w:val="28"/>
               </w:rPr>
-              <w:t xml:space="preserve">Shop attendant/Cashier /Customer Care Specialist — Shoppers Marvel Mart, </w:t>
-            </w:r>
-            <w:r>
-              <w:rPr>
-                <w:rFonts w:asciiTheme="minorHAnsi" w:hAnsiTheme="minorHAnsi" w:cstheme="minorHAnsi"/>
-                <w:b/>
-                <w:sz w:val="28"/>
-              </w:rPr>
-              <w:t>Nairobi</w:t>
+              <w:t>Shop attendant/Cashier /Customer Care Specialist — Shoppers Marvel Mart, Nairobi</w:t>
             </w:r>
           </w:p>
           <w:p>
@@ -1094,14 +1153,7 @@
                 <w:rFonts w:asciiTheme="minorHAnsi" w:hAnsiTheme="minorHAnsi" w:cstheme="minorHAnsi"/>
                 <w:sz w:val="24"/>
               </w:rPr>
-              <w:t xml:space="preserve">Assisted customers with purchases, inquiries and complains, ensuring a welcoming and efficient </w:t>
-            </w:r>
-            <w:r>
-              <w:rPr>
-                <w:rFonts w:asciiTheme="minorHAnsi" w:hAnsiTheme="minorHAnsi" w:cstheme="minorHAnsi"/>
-                <w:sz w:val="24"/>
-              </w:rPr>
-              <w:t>shopping experience</w:t>
+              <w:t>Assisted customers with purchases, inquiries and complains, ensuring a welcoming and efficient shopping experience</w:t>
             </w:r>
           </w:p>
           <w:p>
@@ -1123,14 +1175,7 @@
                 <w:rFonts w:asciiTheme="minorHAnsi" w:hAnsiTheme="minorHAnsi" w:cstheme="minorHAnsi"/>
                 <w:sz w:val="24"/>
               </w:rPr>
-              <w:t xml:space="preserve">Managed point-of-sale operations, </w:t>
-            </w:r>
-            <w:r>
-              <w:rPr>
-                <w:rFonts w:asciiTheme="minorHAnsi" w:hAnsiTheme="minorHAnsi" w:cstheme="minorHAnsi"/>
-                <w:sz w:val="24"/>
-              </w:rPr>
-              <w:t>including</w:t>
+              <w:t>Managed point-of-sale operations, including</w:t>
             </w:r>
             <w:r>
               <w:rPr>
@@ -1144,14 +1189,7 @@
                 <w:rFonts w:asciiTheme="minorHAnsi" w:hAnsiTheme="minorHAnsi" w:cstheme="minorHAnsi"/>
                 <w:sz w:val="24"/>
               </w:rPr>
-              <w:t xml:space="preserve">checks and daily </w:t>
-            </w:r>
-            <w:r>
-              <w:rPr>
-                <w:rFonts w:asciiTheme="minorHAnsi" w:hAnsiTheme="minorHAnsi" w:cstheme="minorHAnsi"/>
-                <w:sz w:val="24"/>
-              </w:rPr>
-              <w:t>reconciliations</w:t>
+              <w:t>checks and daily reconciliations</w:t>
             </w:r>
           </w:p>
           <w:p>
@@ -1173,28 +1211,7 @@
                 <w:rFonts w:asciiTheme="minorHAnsi" w:hAnsiTheme="minorHAnsi" w:cstheme="minorHAnsi"/>
                 <w:sz w:val="24"/>
               </w:rPr>
-              <w:t xml:space="preserve">Supported the </w:t>
-            </w:r>
-            <w:r>
-              <w:rPr>
-                <w:rFonts w:asciiTheme="minorHAnsi" w:hAnsiTheme="minorHAnsi" w:cstheme="minorHAnsi"/>
-                <w:sz w:val="24"/>
-              </w:rPr>
-              <w:t>store team</w:t>
-            </w:r>
-            <w:r>
-              <w:rPr>
-                <w:rFonts w:asciiTheme="minorHAnsi" w:hAnsiTheme="minorHAnsi" w:cstheme="minorHAnsi"/>
-                <w:sz w:val="24"/>
-              </w:rPr>
-              <w:t xml:space="preserve"> with merchandising and maintaining clean, organized and </w:t>
-            </w:r>
-            <w:r>
-              <w:rPr>
-                <w:rFonts w:asciiTheme="minorHAnsi" w:hAnsiTheme="minorHAnsi" w:cstheme="minorHAnsi"/>
-                <w:sz w:val="24"/>
-              </w:rPr>
-              <w:t>safe</w:t>
+              <w:t>Supported the store team with merchandising and maintaining clean, organized and safe</w:t>
             </w:r>
             <w:r>
               <w:rPr>
@@ -1363,6 +1380,20 @@
               <w:t>seasons</w:t>
             </w:r>
           </w:p>
+          <w:p>
+            <w:pPr>
+              <w:pStyle w:val="ListParagraph"/>
+              <w:spacing w:after="0" w:line="311" w:lineRule="auto"/>
+              <w:ind w:left="745"/>
+              <w:jc w:val="both"/>
+              <w:rPr>
+                <w:rFonts w:asciiTheme="minorHAnsi" w:hAnsiTheme="minorHAnsi" w:cstheme="minorHAnsi"/>
+                <w:sz w:val="24"/>
+              </w:rPr>
+            </w:pPr>
+            <w:bookmarkStart w:id="0" w:name="_GoBack"/>
+            <w:bookmarkEnd w:id="0"/>
+          </w:p>
           <w:p/>
           <w:p>
             <w:pPr>
@@ -1390,7 +1421,7 @@
                 <w:sz w:val="28"/>
                 <w:szCs w:val="24"/>
               </w:rPr>
-              <w:t xml:space="preserve">           </w:t>
+              <w:t xml:space="preserve">          </w:t>
             </w:r>
             <w:r>
               <w:rPr>
@@ -1399,7 +1430,7 @@
                 <w:sz w:val="28"/>
                 <w:szCs w:val="24"/>
               </w:rPr>
-              <w:t xml:space="preserve">     January 2026</w:t>
+              <w:t xml:space="preserve">  January 2026</w:t>
             </w:r>
             <w:r>
               <w:rPr>
@@ -1701,15 +1732,7 @@
                 <w:sz w:val="24"/>
                 <w:szCs w:val="24"/>
               </w:rPr>
-              <w:t>Communication and interperso</w:t>
-            </w:r>
-            <w:r>
-              <w:rPr>
-                <w:rFonts w:asciiTheme="minorHAnsi" w:hAnsiTheme="minorHAnsi" w:cstheme="minorHAnsi"/>
-                <w:sz w:val="24"/>
-                <w:szCs w:val="24"/>
-              </w:rPr>
-              <w:t>nal skills</w:t>
+              <w:t>Communication and interpersonal skills</w:t>
             </w:r>
           </w:p>
           <w:p>
@@ -1733,15 +1756,7 @@
                 <w:sz w:val="24"/>
                 <w:szCs w:val="24"/>
               </w:rPr>
-              <w:t>Conflic</w:t>
-            </w:r>
-            <w:r>
-              <w:rPr>
-                <w:rFonts w:asciiTheme="minorHAnsi" w:hAnsiTheme="minorHAnsi" w:cstheme="minorHAnsi"/>
-                <w:sz w:val="24"/>
-                <w:szCs w:val="24"/>
-              </w:rPr>
-              <w:t>t resolution and problems solving</w:t>
+              <w:t>Conflict resolution and problems solving</w:t>
             </w:r>
           </w:p>
           <w:p>
@@ -1765,15 +1780,7 @@
                 <w:sz w:val="24"/>
                 <w:szCs w:val="24"/>
               </w:rPr>
-              <w:t>Teamwor</w:t>
-            </w:r>
-            <w:r>
-              <w:rPr>
-                <w:rFonts w:asciiTheme="minorHAnsi" w:hAnsiTheme="minorHAnsi" w:cstheme="minorHAnsi"/>
-                <w:sz w:val="24"/>
-                <w:szCs w:val="24"/>
-              </w:rPr>
-              <w:t>k and collaboration</w:t>
+              <w:t>Teamwork and collaboration</w:t>
             </w:r>
           </w:p>
           <w:p>
@@ -1797,15 +1804,7 @@
                 <w:sz w:val="24"/>
                 <w:szCs w:val="24"/>
               </w:rPr>
-              <w:t>Time management and adaptabi</w:t>
-            </w:r>
-            <w:r>
-              <w:rPr>
-                <w:rFonts w:asciiTheme="minorHAnsi" w:hAnsiTheme="minorHAnsi" w:cstheme="minorHAnsi"/>
-                <w:sz w:val="24"/>
-                <w:szCs w:val="24"/>
-              </w:rPr>
-              <w:t>lity</w:t>
+              <w:t>Time management and adaptability</w:t>
             </w:r>
           </w:p>
           <w:p>
@@ -1853,15 +1852,7 @@
                 <w:sz w:val="24"/>
                 <w:szCs w:val="24"/>
               </w:rPr>
-              <w:t>Safety awareness and compliance mi</w:t>
-            </w:r>
-            <w:r>
-              <w:rPr>
-                <w:rFonts w:asciiTheme="minorHAnsi" w:hAnsiTheme="minorHAnsi" w:cstheme="minorHAnsi"/>
-                <w:sz w:val="24"/>
-                <w:szCs w:val="24"/>
-              </w:rPr>
-              <w:t>ndset</w:t>
+              <w:t>Safety awareness and compliance mindset</w:t>
             </w:r>
           </w:p>
           <w:p>
@@ -2021,7 +2012,7 @@
       </w:r>
     </w:p>
     <w:sectPr>
-      <w:headerReference w:type="default" r:id="rId12"/>
+      <w:headerReference w:type="default" r:id="rId13"/>
       <w:pgSz w:w="12240" w:h="15840"/>
       <w:pgMar w:top="720" w:right="720" w:bottom="720" w:left="720" w:header="720" w:footer="720" w:gutter="0"/>
       <w:cols w:space="720"/>
@@ -2159,7 +2150,7 @@
 <w:numbering xmlns:wpc="http://schemas.microsoft.com/office/word/2010/wordprocessingCanvas" xmlns:cx="http://schemas.microsoft.com/office/drawing/2014/chartex" xmlns:mc="http://schemas.openxmlformats.org/markup-compatibility/2006" xmlns:o="urn:schemas-microsoft-com:office:office" xmlns:r="http://schemas.openxmlformats.org/officeDocument/2006/relationships" xmlns:m="http://schemas.openxmlformats.org/officeDocument/2006/math" xmlns:v="urn:schemas-microsoft-com:vml" xmlns:wp14="http://schemas.microsoft.com/office/word/2010/wordprocessingDrawing" xmlns:wp="http://schemas.openxmlformats.org/drawingml/2006/wordprocessingDrawing" xmlns:w10="urn:schemas-microsoft-com:office:word" xmlns:w="http://schemas.openxmlformats.org/wordprocessingml/2006/main" xmlns:w14="http://schemas.microsoft.com/office/word/2010/wordml" xmlns:w15="http://schemas.microsoft.com/office/word/2012/wordml" xmlns:w16se="http://schemas.microsoft.com/office/word/2015/wordml/symex" xmlns:wpg="http://schemas.microsoft.com/office/word/2010/wordprocessingGroup" xmlns:wpi="http://schemas.microsoft.com/office/word/2010/wordprocessingInk" xmlns:wne="http://schemas.microsoft.com/office/word/2006/wordml" xmlns:wps="http://schemas.microsoft.com/office/word/2010/wordprocessingShape" mc:Ignorable="w14 w15 w16se wp14">
   <w:numPicBullet w:numPicBulletId="0">
     <w:pict>
-      <v:shape id="_x0000_i1058" style="width:6pt;height:6pt" coordsize="" o:spt="100" o:bullet="t" adj="0,,0" path="" stroked="f">
+      <v:shape id="_x0000_i1028" style="width:6pt;height:6pt" coordsize="" o:spt="100" o:bullet="t" adj="0,,0" path="" stroked="f">
         <v:stroke joinstyle="miter"/>
         <v:imagedata r:id="rId1" o:title="image6"/>
         <v:formulas/>
@@ -5384,23 +5375,6 @@
 </file>
 
 <file path=customXml/item1.xml><?xml version="1.0" encoding="utf-8"?>
-<?mso-contentType ?>
-<FormTemplates xmlns="http://schemas.microsoft.com/sharepoint/v3/contenttype/forms">
-  <Display>DocumentLibraryForm</Display>
-  <Edit>DocumentLibraryForm</Edit>
-  <New>DocumentLibraryForm</New>
-</FormTemplates>
-</file>
-
-<file path=customXml/item2.xml><?xml version="1.0" encoding="utf-8"?>
-<p:properties xmlns:p="http://schemas.microsoft.com/office/2006/metadata/properties" xmlns:xsi="http://www.w3.org/2001/XMLSchema-instance" xmlns:pc="http://schemas.microsoft.com/office/infopath/2007/PartnerControls">
-  <documentManagement>
-    <MediaServiceKeyPoints xmlns="71af3243-3dd4-4a8d-8c0d-dd76da1f02a5" xsi:nil="true"/>
-  </documentManagement>
-</p:properties>
-</file>
-
-<file path=customXml/item3.xml><?xml version="1.0" encoding="utf-8"?>
 <ct:contentTypeSchema xmlns:ct="http://schemas.microsoft.com/office/2006/metadata/contentType" xmlns:ma="http://schemas.microsoft.com/office/2006/metadata/properties/metaAttributes" ct:_="" ma:_="" ma:contentTypeName="Document" ma:contentTypeID="0x01010079F111ED35F8CC479449609E8A0923A6" ma:contentTypeVersion="11" ma:contentTypeDescription="Create a new document." ma:contentTypeScope="" ma:versionID="1c2eb7a32e66fb6e4260f3771546a5e2">
   <xsd:schema xmlns:xsd="http://www.w3.org/2001/XMLSchema" xmlns:xs="http://www.w3.org/2001/XMLSchema" xmlns:p="http://schemas.microsoft.com/office/2006/metadata/properties" xmlns:ns2="71af3243-3dd4-4a8d-8c0d-dd76da1f02a5" xmlns:ns3="16c05727-aa75-4e4a-9b5f-8a80a1165891" targetNamespace="http://schemas.microsoft.com/office/2006/metadata/properties" ma:root="true" ma:fieldsID="04e1f6479c48b08974ba73b5ca973489" ns2:_="" ns3:_="">
     <xsd:import namespace="71af3243-3dd4-4a8d-8c0d-dd76da1f02a5"/>
@@ -5611,25 +5585,24 @@
 </ct:contentTypeSchema>
 </file>
 
-<file path=customXml/itemProps1.xml><?xml version="1.0" encoding="utf-8"?>
-<ds:datastoreItem xmlns:ds="http://schemas.openxmlformats.org/officeDocument/2006/customXml" ds:itemID="{18506A0D-4821-47C2-BD9B-CACF27C6B108}">
-  <ds:schemaRefs>
-    <ds:schemaRef ds:uri="http://schemas.microsoft.com/sharepoint/v3/contenttype/forms"/>
-  </ds:schemaRefs>
-</ds:datastoreItem>
+<file path=customXml/item2.xml><?xml version="1.0" encoding="utf-8"?>
+<p:properties xmlns:p="http://schemas.microsoft.com/office/2006/metadata/properties" xmlns:xsi="http://www.w3.org/2001/XMLSchema-instance" xmlns:pc="http://schemas.microsoft.com/office/infopath/2007/PartnerControls">
+  <documentManagement>
+    <MediaServiceKeyPoints xmlns="71af3243-3dd4-4a8d-8c0d-dd76da1f02a5" xsi:nil="true"/>
+  </documentManagement>
+</p:properties>
 </file>
 
-<file path=customXml/itemProps2.xml><?xml version="1.0" encoding="utf-8"?>
-<ds:datastoreItem xmlns:ds="http://schemas.openxmlformats.org/officeDocument/2006/customXml" ds:itemID="{DD14EC26-251D-443A-AF4F-B15D0F3B0F84}">
-  <ds:schemaRefs>
-    <ds:schemaRef ds:uri="http://schemas.microsoft.com/office/2006/metadata/properties"/>
-    <ds:schemaRef ds:uri="http://schemas.microsoft.com/office/infopath/2007/PartnerControls"/>
-    <ds:schemaRef ds:uri="71af3243-3dd4-4a8d-8c0d-dd76da1f02a5"/>
-  </ds:schemaRefs>
-</ds:datastoreItem>
+<file path=customXml/item3.xml><?xml version="1.0" encoding="utf-8"?>
+<?mso-contentType ?>
+<FormTemplates xmlns="http://schemas.microsoft.com/sharepoint/v3/contenttype/forms">
+  <Display>DocumentLibraryForm</Display>
+  <Edit>DocumentLibraryForm</Edit>
+  <New>DocumentLibraryForm</New>
+</FormTemplates>
 </file>
 
-<file path=customXml/itemProps3.xml><?xml version="1.0" encoding="utf-8"?>
+<file path=customXml/itemProps1.xml><?xml version="1.0" encoding="utf-8"?>
 <ds:datastoreItem xmlns:ds="http://schemas.openxmlformats.org/officeDocument/2006/customXml" ds:itemID="{8143E149-BD72-41A7-8F13-AF59DE30D6FA}">
   <ds:schemaRefs>
     <ds:schemaRef ds:uri="http://schemas.microsoft.com/office/2006/metadata/contentType"/>
@@ -5646,4 +5619,22 @@
     <ds:schemaRef ds:uri="http://schemas.microsoft.com/internal/obd"/>
   </ds:schemaRefs>
 </ds:datastoreItem>
+</file>
+
+<file path=customXml/itemProps2.xml><?xml version="1.0" encoding="utf-8"?>
+<ds:datastoreItem xmlns:ds="http://schemas.openxmlformats.org/officeDocument/2006/customXml" ds:itemID="{DD14EC26-251D-443A-AF4F-B15D0F3B0F84}">
+  <ds:schemaRefs>
+    <ds:schemaRef ds:uri="http://schemas.microsoft.com/office/2006/metadata/properties"/>
+    <ds:schemaRef ds:uri="http://schemas.microsoft.com/office/infopath/2007/PartnerControls"/>
+    <ds:schemaRef ds:uri="71af3243-3dd4-4a8d-8c0d-dd76da1f02a5"/>
+  </ds:schemaRefs>
+</ds:datastoreItem>
+</file>
+
+<file path=customXml/itemProps3.xml><?xml version="1.0" encoding="utf-8"?>
+<ds:datastoreItem xmlns:ds="http://schemas.openxmlformats.org/officeDocument/2006/customXml" ds:itemID="{18506A0D-4821-47C2-BD9B-CACF27C6B108}">
+  <ds:schemaRefs>
+    <ds:schemaRef ds:uri="http://schemas.microsoft.com/sharepoint/v3/contenttype/forms"/>
+  </ds:schemaRefs>
+</ds:datastoreItem>
 </file>
</xml_diff>